<commit_message>
Prepend top orange header wave banner and CIS certification logos to Word document
</commit_message>
<xml_diff>
--- a/Industrial_Engineering_PMO_ERP_Document.docx
+++ b/Industrial_Engineering_PMO_ERP_Document.docx
@@ -4071,6 +4071,428 @@
       <w:pgNumType w:start="1"/>
       <w:cols w:num="1"/>
     </w:sectPr>
+    <w:p>
+      <w:pPr>
+        <w:rPr>
+          <w:sz w:val="19"/>
+          <w:szCs w:val="19"/>
+        </w:rPr>
+      </w:pPr>
+      <w:r>
+        <w:rPr>
+          <w:rtl w:val="0"/>
+        </w:rPr>
+      </w:r>
+    </w:p>
+    <w:p>
+      <w:pPr>
+        <w:ind w:left="3576" w:firstLine="0"/>
+        <w:rPr>
+          <w:sz w:val="20"/>
+          <w:szCs w:val="20"/>
+        </w:rPr>
+      </w:pPr>
+      <w:r>
+        <w:rPr>
+          <w:sz w:val="20"/>
+          <w:szCs w:val="20"/>
+        </w:rPr>
+        <w:drawing>
+          <wp:inline distT="0" distB="0" distL="0" distR="0" wp14:anchorId="430BA553" wp14:editId="7777777">
+            <wp:extent cx="2268831" cy="1362836"/>
+            <wp:effectExtent l="0" t="0" r="0" b="0"/>
+            <wp:docPr id="6" name="image1.jpg"/>
+            <a:graphic>
+              <a:graphicData uri="http://schemas.openxmlformats.org/drawingml/2006/picture">
+                <pic:pic>
+                  <pic:nvPicPr>
+                    <pic:cNvPr id="0" name="image1.jpg"/>
+                    <pic:cNvPicPr preferRelativeResize="0"/>
+                  </pic:nvPicPr>
+                  <pic:blipFill>
+                    <a:blip r:embed="rId6"/>
+                    <a:srcRect l="0" t="0" r="0" b="0"/>
+                    <a:stretch>
+                      <a:fillRect/>
+                    </a:stretch>
+                  </pic:blipFill>
+                  <pic:spPr>
+                    <a:xfrm>
+                      <a:off x="0" y="0"/>
+                      <a:ext cx="2268831" cy="1362836"/>
+                    </a:xfrm>
+                    <a:prstGeom prst="rect"/>
+                    <a:ln/>
+                  </pic:spPr>
+                </pic:pic>
+              </a:graphicData>
+            </a:graphic>
+          </wp:inline>
+        </w:drawing>
+      </w:r>
+      <w:r>
+        <w:rPr>
+          <w:rtl w:val="0"/>
+        </w:rPr>
+      </w:r>
+    </w:p>
+    <w:p>
+      <w:pPr>
+        <w:rPr>
+          <w:sz w:val="20"/>
+          <w:szCs w:val="20"/>
+        </w:rPr>
+      </w:pPr>
+      <w:r>
+        <w:rPr>
+          <w:rtl w:val="0"/>
+        </w:rPr>
+      </w:r>
+    </w:p>
+    <w:p>
+      <w:pPr>
+        <w:rPr>
+          <w:sz w:val="20"/>
+          <w:szCs w:val="20"/>
+        </w:rPr>
+      </w:pPr>
+      <w:r>
+        <w:rPr>
+          <w:rtl w:val="0"/>
+        </w:rPr>
+      </w:r>
+    </w:p>
+    <w:p>
+      <w:pPr>
+        <w:spacing w:before="7" w:lineRule="auto"/>
+        <w:rPr>
+          <w:sz w:val="13"/>
+          <w:szCs w:val="13"/>
+        </w:rPr>
+      </w:pPr>
+      <w:r>
+        <w:rPr>
+          <w:rtl w:val="0"/>
+        </w:rPr>
+      </w:r>
+      <w:r>
+        <mc:AlternateContent>
+          <mc:Choice Requires="wpg">
+            <w:drawing>
+              <wp:anchor distT="0" distB="0" distL="114300" distR="114300" simplePos="0" relativeHeight="0" behindDoc="0" locked="0" layoutInCell="1" hidden="0" allowOverlap="1" wp14:anchorId="579BCEB0" wp14:editId="7777777">
+                <wp:simplePos x="0" y="0"/>
+                <wp:positionH relativeFrom="column">
+                  <wp:posOffset>87321</wp:posOffset>
+                </wp:positionH>
+                <wp:positionV relativeFrom="paragraph">
+                  <wp:posOffset>23813</wp:posOffset>
+                </wp:positionV>
+                <wp:extent cx="6102350" cy="114935"/>
+                <wp:effectExtent l="0" t="0" r="0" b="0"/>
+                <wp:wrapTopAndBottom distT="0" distB="0"/>
+                <wp:docPr id="2" name=""/>
+                <a:graphic>
+                  <a:graphicData uri="http://schemas.microsoft.com/office/word/2010/wordprocessingShape">
+                    <wps:wsp>
+                      <wps:cNvSpPr/>
+                      <wps:cNvPr id="3" name="Shape 3"/>
+                      <wps:spPr>
+                        <a:xfrm rot="10800000" flipH="1">
+                          <a:off x="2313875" y="3741583"/>
+                          <a:ext cx="6064250" cy="76835"/>
+                        </a:xfrm>
+                        <a:custGeom>
+                          <a:rect l="l" t="t" r="r" b="b"/>
+                          <a:pathLst>
+                            <a:path w="8460" h="120000" extrusionOk="0">
+                              <a:moveTo>
+                                <a:pt x="0" y="0"/>
+                              </a:moveTo>
+                              <a:lnTo>
+                                <a:pt x="8460" y="0"/>
+                              </a:lnTo>
+                            </a:path>
+                          </a:pathLst>
+                        </a:custGeom>
+                        <a:noFill/>
+                        <a:ln w="9525" cap="flat" cmpd="sng">
+                          <a:solidFill>
+                            <a:srgbClr val="CFCDCD"/>
+                          </a:solidFill>
+                          <a:prstDash val="solid"/>
+                          <a:round/>
+                          <a:headEnd type="none" w="sm" len="sm"/>
+                          <a:tailEnd type="none" w="sm" len="sm"/>
+                        </a:ln>
+                      </wps:spPr>
+                      <wps:bodyPr spcFirstLastPara="1" wrap="square" lIns="91425" tIns="91425" rIns="91425" bIns="91425" anchor="ctr" anchorCtr="0">
+                        <a:noAutofit/>
+                      </wps:bodyPr>
+                    </wps:wsp>
+                  </a:graphicData>
+                </a:graphic>
+              </wp:anchor>
+            </w:drawing>
+          </mc:Choice>
+          <mc:Fallback>
+            <w:drawing>
+              <wp:anchor distT="0" distB="0" distL="114300" distR="114300" simplePos="0" relativeHeight="0" behindDoc="0" locked="0" layoutInCell="1" hidden="0" allowOverlap="1" wp14:anchorId="721C67BF" wp14:editId="7777777">
+                <wp:simplePos x="0" y="0"/>
+                <wp:positionH relativeFrom="column">
+                  <wp:posOffset>87321</wp:posOffset>
+                </wp:positionH>
+                <wp:positionV relativeFrom="paragraph">
+                  <wp:posOffset>23813</wp:posOffset>
+                </wp:positionV>
+                <wp:extent cx="6102350" cy="114935"/>
+                <wp:effectExtent l="0" t="0" r="0" b="0"/>
+                <wp:wrapTopAndBottom distT="0" distB="0"/>
+                <wp:docPr id="1224701795" name="image6.png"/>
+                <a:graphic>
+                  <a:graphicData uri="http://schemas.openxmlformats.org/drawingml/2006/picture">
+                    <pic:pic>
+                      <pic:nvPicPr>
+                        <pic:cNvPr id="0" name="image6.png"/>
+                        <pic:cNvPicPr preferRelativeResize="0"/>
+                      </pic:nvPicPr>
+                      <pic:blipFill>
+                        <a:blip r:embed="rId7"/>
+                        <a:srcRect/>
+                        <a:stretch>
+                          <a:fillRect/>
+                        </a:stretch>
+                      </pic:blipFill>
+                      <pic:spPr>
+                        <a:xfrm>
+                          <a:off x="0" y="0"/>
+                          <a:ext cx="6102350" cy="114935"/>
+                        </a:xfrm>
+                        <a:prstGeom prst="rect"/>
+                        <a:ln/>
+                      </pic:spPr>
+                    </pic:pic>
+                  </a:graphicData>
+                </a:graphic>
+              </wp:anchor>
+            </w:drawing>
+          </mc:Fallback>
+        </mc:AlternateContent>
+      </w:r>
+    </w:p>
+    <w:p>
+      <w:pPr>
+        <w:spacing w:before="10" w:lineRule="auto"/>
+        <w:rPr>
+          <w:sz w:val="13"/>
+          <w:szCs w:val="13"/>
+        </w:rPr>
+      </w:pPr>
+      <w:r>
+        <w:rPr>
+          <w:rtl w:val="0"/>
+        </w:rPr>
+      </w:r>
+      <w:r>
+        <w:drawing>
+          <wp:anchor distT="0" distB="0" distL="0" distR="0" simplePos="0" relativeHeight="0" behindDoc="0" locked="0" layoutInCell="1" hidden="0" allowOverlap="1" wp14:anchorId="4BCA4F48" wp14:editId="7777777">
+            <wp:simplePos x="0" y="0"/>
+            <wp:positionH relativeFrom="column">
+              <wp:posOffset>685800</wp:posOffset>
+            </wp:positionH>
+            <wp:positionV relativeFrom="paragraph">
+              <wp:posOffset>126362</wp:posOffset>
+            </wp:positionV>
+            <wp:extent cx="5405713" cy="679132"/>
+            <wp:effectExtent l="0" t="0" r="0" b="0"/>
+            <wp:wrapTopAndBottom distT="0" distB="0"/>
+            <wp:docPr id="7" name="image2.jpg"/>
+            <a:graphic>
+              <a:graphicData uri="http://schemas.openxmlformats.org/drawingml/2006/picture">
+                <pic:pic>
+                  <pic:nvPicPr>
+                    <pic:cNvPr id="0" name="image2.jpg"/>
+                    <pic:cNvPicPr preferRelativeResize="0"/>
+                  </pic:nvPicPr>
+                  <pic:blipFill>
+                    <a:blip r:embed="rId8"/>
+                    <a:srcRect l="0" t="0" r="0" b="0"/>
+                    <a:stretch>
+                      <a:fillRect/>
+                    </a:stretch>
+                  </pic:blipFill>
+                  <pic:spPr>
+                    <a:xfrm>
+                      <a:off x="0" y="0"/>
+                      <a:ext cx="5405713" cy="679132"/>
+                    </a:xfrm>
+                    <a:prstGeom prst="rect"/>
+                    <a:ln/>
+                  </pic:spPr>
+                </pic:pic>
+              </a:graphicData>
+            </a:graphic>
+          </wp:anchor>
+        </w:drawing>
+      </w:r>
+    </w:p>
+    <w:p>
+      <w:pPr>
+        <w:rPr>
+          <w:sz w:val="20"/>
+          <w:szCs w:val="20"/>
+        </w:rPr>
+      </w:pPr>
+      <w:r>
+        <w:rPr>
+          <w:rtl w:val="0"/>
+        </w:rPr>
+      </w:r>
+    </w:p>
+    <w:p>
+      <w:pPr>
+        <w:spacing w:before="1" w:lineRule="auto"/>
+        <w:rPr>
+          <w:sz w:val="12"/>
+          <w:szCs w:val="12"/>
+        </w:rPr>
+      </w:pPr>
+      <w:r>
+        <w:rPr>
+          <w:rtl w:val="0"/>
+        </w:rPr>
+      </w:r>
+      <w:r>
+        <mc:AlternateContent>
+          <mc:Choice Requires="wpg">
+            <w:drawing>
+              <wp:anchor distT="0" distB="0" distL="114300" distR="114300" simplePos="0" relativeHeight="0" behindDoc="0" locked="0" layoutInCell="1" hidden="0" allowOverlap="1" wp14:anchorId="19F11C2A" wp14:editId="7777777">
+                <wp:simplePos x="0" y="0"/>
+                <wp:positionH relativeFrom="column">
+                  <wp:posOffset>125414</wp:posOffset>
+                </wp:positionH>
+                <wp:positionV relativeFrom="paragraph">
+                  <wp:posOffset>-1586</wp:posOffset>
+                </wp:positionV>
+                <wp:extent cx="6102350" cy="132080"/>
+                <wp:effectExtent l="0" t="0" r="0" b="0"/>
+                <wp:wrapTopAndBottom distT="0" distB="0"/>
+                <wp:docPr id="1" name=""/>
+                <a:graphic>
+                  <a:graphicData uri="http://schemas.microsoft.com/office/word/2010/wordprocessingShape">
+                    <wps:wsp>
+                      <wps:cNvSpPr/>
+                      <wps:cNvPr id="2" name="Shape 2"/>
+                      <wps:spPr>
+                        <a:xfrm rot="10800000" flipH="1">
+                          <a:off x="2313875" y="3733010"/>
+                          <a:ext cx="6064250" cy="93980"/>
+                        </a:xfrm>
+                        <a:custGeom>
+                          <a:rect l="l" t="t" r="r" b="b"/>
+                          <a:pathLst>
+                            <a:path w="8460" h="120000" extrusionOk="0">
+                              <a:moveTo>
+                                <a:pt x="0" y="0"/>
+                              </a:moveTo>
+                              <a:lnTo>
+                                <a:pt x="8460" y="0"/>
+                              </a:lnTo>
+                            </a:path>
+                          </a:pathLst>
+                        </a:custGeom>
+                        <a:noFill/>
+                        <a:ln w="9525" cap="flat" cmpd="sng">
+                          <a:solidFill>
+                            <a:srgbClr val="CFCDCD"/>
+                          </a:solidFill>
+                          <a:prstDash val="solid"/>
+                          <a:round/>
+                          <a:headEnd type="none" w="sm" len="sm"/>
+                          <a:tailEnd type="none" w="sm" len="sm"/>
+                        </a:ln>
+                      </wps:spPr>
+                      <wps:bodyPr spcFirstLastPara="1" wrap="square" lIns="91425" tIns="91425" rIns="91425" bIns="91425" anchor="ctr" anchorCtr="0">
+                        <a:noAutofit/>
+                      </wps:bodyPr>
+                    </wps:wsp>
+                  </a:graphicData>
+                </a:graphic>
+              </wp:anchor>
+            </w:drawing>
+          </mc:Choice>
+          <mc:Fallback>
+            <w:drawing>
+              <wp:anchor distT="0" distB="0" distL="114300" distR="114300" simplePos="0" relativeHeight="0" behindDoc="0" locked="0" layoutInCell="1" hidden="0" allowOverlap="1" wp14:anchorId="24EB9FA4" wp14:editId="7777777">
+                <wp:simplePos x="0" y="0"/>
+                <wp:positionH relativeFrom="column">
+                  <wp:posOffset>125414</wp:posOffset>
+                </wp:positionH>
+                <wp:positionV relativeFrom="paragraph">
+                  <wp:posOffset>-1586</wp:posOffset>
+                </wp:positionV>
+                <wp:extent cx="6102350" cy="132080"/>
+                <wp:effectExtent l="0" t="0" r="0" b="0"/>
+                <wp:wrapTopAndBottom distT="0" distB="0"/>
+                <wp:docPr id="1984950975" name="image5.png"/>
+                <a:graphic>
+                  <a:graphicData uri="http://schemas.openxmlformats.org/drawingml/2006/picture">
+                    <pic:pic>
+                      <pic:nvPicPr>
+                        <pic:cNvPr id="0" name="image5.png"/>
+                        <pic:cNvPicPr preferRelativeResize="0"/>
+                      </pic:nvPicPr>
+                      <pic:blipFill>
+                        <a:blip r:embed="rId7"/>
+                        <a:srcRect/>
+                        <a:stretch>
+                          <a:fillRect/>
+                        </a:stretch>
+                      </pic:blipFill>
+                      <pic:spPr>
+                        <a:xfrm>
+                          <a:off x="0" y="0"/>
+                          <a:ext cx="6102350" cy="132080"/>
+                        </a:xfrm>
+                        <a:prstGeom prst="rect"/>
+                        <a:ln/>
+                      </pic:spPr>
+                    </pic:pic>
+                  </a:graphicData>
+                </a:graphic>
+              </wp:anchor>
+            </w:drawing>
+          </mc:Fallback>
+        </mc:AlternateContent>
+      </w:r>
+    </w:p>
+    <w:p>
+      <w:pPr>
+        <w:jc w:val="both"/>
+        <w:rPr>
+          <w:sz w:val="40"/>
+          <w:szCs w:val="40"/>
+        </w:rPr>
+      </w:pPr>
+      <w:r>
+        <w:rPr>
+          <w:rtl w:val="0"/>
+        </w:rPr>
+      </w:r>
+    </w:p>
+    <w:p>
+      <w:pPr>
+        <w:jc w:val="both"/>
+        <w:rPr>
+          <w:sz w:val="20"/>
+          <w:szCs w:val="20"/>
+        </w:rPr>
+      </w:pPr>
+      <w:r>
+        <w:rPr>
+          <w:rtl w:val="0"/>
+        </w:rPr>
+      </w:r>
+    </w:p>
   </w:body>
 </w:document>
 </file>

</xml_diff>